<commit_message>
Added Data Visualization project on Tableau Public
</commit_message>
<xml_diff>
--- a/public/docs/poole-resume-product.docx
+++ b/public/docs/poole-resume-product.docx
@@ -16,12 +16,6 @@
         <w:gridCol w:w="5940"/>
       </w:tblGrid>
       <w:tr>
-        <w:tblPrEx>
-          <w:tblCellMar>
-            <w:top w:w="0" w:type="dxa"/>
-            <w:bottom w:w="0" w:type="dxa"/>
-          </w:tblCellMar>
-        </w:tblPrEx>
         <w:tc>
           <w:tcPr>
             <w:tcW w:w="4500" w:type="dxa"/>
@@ -205,23 +199,7 @@
           <w:sz w:val="22"/>
           <w:szCs w:val="22"/>
         </w:rPr>
-        <w:t>|</w:t>
-      </w:r>
-      <w:r>
-        <w:rPr>
-          <w:color w:val="A0AEC0"/>
-          <w:sz w:val="22"/>
-          <w:szCs w:val="22"/>
-        </w:rPr>
-        <w:t xml:space="preserve"> </w:t>
-      </w:r>
-      <w:r>
-        <w:rPr>
-          <w:color w:val="A0AEC0"/>
-          <w:sz w:val="22"/>
-          <w:szCs w:val="22"/>
-        </w:rPr>
-        <w:t xml:space="preserve"> </w:t>
+        <w:t xml:space="preserve">|  </w:t>
       </w:r>
       <w:r>
         <w:rPr>
@@ -269,32 +247,16 @@
           <w:sz w:val="22"/>
           <w:szCs w:val="22"/>
         </w:rPr>
-        <w:t xml:space="preserve"> </w:t>
-      </w:r>
+        <w:t xml:space="preserve"> |</w:t>
+      </w:r>
+      <w:proofErr w:type="gramEnd"/>
       <w:r>
         <w:rPr>
           <w:color w:val="A0AEC0"/>
           <w:sz w:val="22"/>
           <w:szCs w:val="22"/>
         </w:rPr>
-        <w:t>|</w:t>
-      </w:r>
-      <w:proofErr w:type="gramEnd"/>
-      <w:r>
-        <w:rPr>
-          <w:color w:val="A0AEC0"/>
-          <w:sz w:val="22"/>
-          <w:szCs w:val="22"/>
-        </w:rPr>
-        <w:t xml:space="preserve"> </w:t>
-      </w:r>
-      <w:r>
-        <w:rPr>
-          <w:color w:val="A0AEC0"/>
-          <w:sz w:val="22"/>
-          <w:szCs w:val="22"/>
-        </w:rPr>
-        <w:t xml:space="preserve"> </w:t>
+        <w:t xml:space="preserve">  </w:t>
       </w:r>
       <w:r>
         <w:rPr>
@@ -404,14 +366,7 @@
           <w:b/>
           <w:bCs/>
         </w:rPr>
-        <w:t xml:space="preserve">I’m an Agentic AI-first </w:t>
-      </w:r>
-      <w:r>
-        <w:rPr>
-          <w:b/>
-          <w:bCs/>
-        </w:rPr>
-        <w:t>Product leader</w:t>
+        <w:t>I’m an Agentic AI-first Product leader</w:t>
       </w:r>
       <w:r>
         <w:t xml:space="preserve"> with 25+ years spanning financial services, enterprise SaaS, and digital platform strategy. Built wealth management technology from startup to $40B AUA at Orion Advisor Services, then scaled enterprise product adoption and change management at PayPal (30,000+ employees) and Autodesk. Combines deep financial services domain expertise with hands-on AI/ML product delivery, data platform strategy, and </w:t>
@@ -457,12 +412,6 @@
         <w:gridCol w:w="5220"/>
       </w:tblGrid>
       <w:tr>
-        <w:tblPrEx>
-          <w:tblCellMar>
-            <w:top w:w="0" w:type="dxa"/>
-            <w:bottom w:w="0" w:type="dxa"/>
-          </w:tblCellMar>
-        </w:tblPrEx>
         <w:tc>
           <w:tcPr>
             <w:tcW w:w="5220" w:type="dxa"/>
@@ -1223,12 +1172,6 @@
         <w:gridCol w:w="2088"/>
       </w:tblGrid>
       <w:tr>
-        <w:tblPrEx>
-          <w:tblCellMar>
-            <w:top w:w="0" w:type="dxa"/>
-            <w:bottom w:w="0" w:type="dxa"/>
-          </w:tblCellMar>
-        </w:tblPrEx>
         <w:tc>
           <w:tcPr>
             <w:tcW w:w="2088" w:type="dxa"/>
@@ -1542,12 +1485,6 @@
         </w:tc>
       </w:tr>
       <w:tr>
-        <w:tblPrEx>
-          <w:tblCellMar>
-            <w:top w:w="0" w:type="dxa"/>
-            <w:bottom w:w="0" w:type="dxa"/>
-          </w:tblCellMar>
-        </w:tblPrEx>
         <w:tc>
           <w:tcPr>
             <w:tcW w:w="2088" w:type="dxa"/>

</xml_diff>